<commit_message>
Add Dockerfile examples and remove temporary files
</commit_message>
<xml_diff>
--- a/Tuan04/Minh Chứng.docx
+++ b/Tuan04/Minh Chứng.docx
@@ -2808,6 +2808,582 @@
           </wp:inline>
         </w:drawing>
       </w:r>
+      <w:r>
+        <w:rPr>
+          <w:rFonts w:ascii="Times New Roman" w:hAnsi="Times New Roman" w:cs="Times New Roman"/>
+          <w:sz w:val="26"/>
+          <w:szCs w:val="26"/>
+        </w:rPr>
+        <w:t>3</w:t>
+      </w:r>
+      <w:r>
+        <w:rPr>
+          <w:rFonts w:ascii="Times New Roman" w:hAnsi="Times New Roman" w:cs="Times New Roman"/>
+          <w:sz w:val="26"/>
+          <w:szCs w:val="26"/>
+        </w:rPr>
+        <w:t xml:space="preserve">. </w:t>
+      </w:r>
+      <w:r>
+        <w:rPr>
+          <w:rFonts w:ascii="Times New Roman" w:hAnsi="Times New Roman" w:cs="Times New Roman"/>
+          <w:sz w:val="26"/>
+          <w:szCs w:val="26"/>
+        </w:rPr>
+        <w:t>Bài 3: Tạo Dockerfile chạy một ứng dụng React</w:t>
+      </w:r>
+    </w:p>
+    <w:p>
+      <w:pPr>
+        <w:rPr>
+          <w:rFonts w:ascii="Times New Roman" w:hAnsi="Times New Roman" w:cs="Times New Roman"/>
+          <w:sz w:val="26"/>
+          <w:szCs w:val="26"/>
+        </w:rPr>
+      </w:pPr>
+      <w:r>
+        <w:rPr>
+          <w:rFonts w:ascii="Times New Roman" w:hAnsi="Times New Roman" w:cs="Times New Roman"/>
+          <w:sz w:val="26"/>
+          <w:szCs w:val="26"/>
+        </w:rPr>
+        <w:lastRenderedPageBreak/>
+        <w:drawing>
+          <wp:inline distT="0" distB="0" distL="0" distR="0" wp14:anchorId="64E54CD3" wp14:editId="71578931">
+            <wp:extent cx="5943600" cy="2837815"/>
+            <wp:effectExtent l="0" t="0" r="0" b="635"/>
+            <wp:docPr id="39" name="Picture 39"/>
+            <wp:cNvGraphicFramePr>
+              <a:graphicFrameLocks xmlns:a="http://schemas.openxmlformats.org/drawingml/2006/main" noChangeAspect="1"/>
+            </wp:cNvGraphicFramePr>
+            <a:graphic xmlns:a="http://schemas.openxmlformats.org/drawingml/2006/main">
+              <a:graphicData uri="http://schemas.openxmlformats.org/drawingml/2006/picture">
+                <pic:pic xmlns:pic="http://schemas.openxmlformats.org/drawingml/2006/picture">
+                  <pic:nvPicPr>
+                    <pic:cNvPr id="1" name=""/>
+                    <pic:cNvPicPr/>
+                  </pic:nvPicPr>
+                  <pic:blipFill>
+                    <a:blip r:embed="rId40"/>
+                    <a:stretch>
+                      <a:fillRect/>
+                    </a:stretch>
+                  </pic:blipFill>
+                  <pic:spPr>
+                    <a:xfrm>
+                      <a:off x="0" y="0"/>
+                      <a:ext cx="5943600" cy="2837815"/>
+                    </a:xfrm>
+                    <a:prstGeom prst="rect">
+                      <a:avLst/>
+                    </a:prstGeom>
+                  </pic:spPr>
+                </pic:pic>
+              </a:graphicData>
+            </a:graphic>
+          </wp:inline>
+        </w:drawing>
+      </w:r>
+      <w:r>
+        <w:rPr>
+          <w:rFonts w:ascii="Times New Roman" w:hAnsi="Times New Roman" w:cs="Times New Roman"/>
+          <w:sz w:val="26"/>
+          <w:szCs w:val="26"/>
+        </w:rPr>
+        <w:drawing>
+          <wp:inline distT="0" distB="0" distL="0" distR="0" wp14:anchorId="33EB40D3" wp14:editId="3DD2CD45">
+            <wp:extent cx="5943600" cy="1816100"/>
+            <wp:effectExtent l="0" t="0" r="0" b="0"/>
+            <wp:docPr id="40" name="Picture 40"/>
+            <wp:cNvGraphicFramePr>
+              <a:graphicFrameLocks xmlns:a="http://schemas.openxmlformats.org/drawingml/2006/main" noChangeAspect="1"/>
+            </wp:cNvGraphicFramePr>
+            <a:graphic xmlns:a="http://schemas.openxmlformats.org/drawingml/2006/main">
+              <a:graphicData uri="http://schemas.openxmlformats.org/drawingml/2006/picture">
+                <pic:pic xmlns:pic="http://schemas.openxmlformats.org/drawingml/2006/picture">
+                  <pic:nvPicPr>
+                    <pic:cNvPr id="1" name=""/>
+                    <pic:cNvPicPr/>
+                  </pic:nvPicPr>
+                  <pic:blipFill>
+                    <a:blip r:embed="rId41"/>
+                    <a:stretch>
+                      <a:fillRect/>
+                    </a:stretch>
+                  </pic:blipFill>
+                  <pic:spPr>
+                    <a:xfrm>
+                      <a:off x="0" y="0"/>
+                      <a:ext cx="5943600" cy="1816100"/>
+                    </a:xfrm>
+                    <a:prstGeom prst="rect">
+                      <a:avLst/>
+                    </a:prstGeom>
+                  </pic:spPr>
+                </pic:pic>
+              </a:graphicData>
+            </a:graphic>
+          </wp:inline>
+        </w:drawing>
+      </w:r>
+      <w:r>
+        <w:rPr>
+          <w:rFonts w:ascii="Times New Roman" w:hAnsi="Times New Roman" w:cs="Times New Roman"/>
+          <w:sz w:val="26"/>
+          <w:szCs w:val="26"/>
+        </w:rPr>
+        <w:drawing>
+          <wp:inline distT="0" distB="0" distL="0" distR="0" wp14:anchorId="0808B0B0" wp14:editId="57C2741E">
+            <wp:extent cx="5943600" cy="3400425"/>
+            <wp:effectExtent l="0" t="0" r="0" b="9525"/>
+            <wp:docPr id="41" name="Picture 41"/>
+            <wp:cNvGraphicFramePr>
+              <a:graphicFrameLocks xmlns:a="http://schemas.openxmlformats.org/drawingml/2006/main" noChangeAspect="1"/>
+            </wp:cNvGraphicFramePr>
+            <a:graphic xmlns:a="http://schemas.openxmlformats.org/drawingml/2006/main">
+              <a:graphicData uri="http://schemas.openxmlformats.org/drawingml/2006/picture">
+                <pic:pic xmlns:pic="http://schemas.openxmlformats.org/drawingml/2006/picture">
+                  <pic:nvPicPr>
+                    <pic:cNvPr id="1" name=""/>
+                    <pic:cNvPicPr/>
+                  </pic:nvPicPr>
+                  <pic:blipFill>
+                    <a:blip r:embed="rId42"/>
+                    <a:stretch>
+                      <a:fillRect/>
+                    </a:stretch>
+                  </pic:blipFill>
+                  <pic:spPr>
+                    <a:xfrm>
+                      <a:off x="0" y="0"/>
+                      <a:ext cx="5943600" cy="3400425"/>
+                    </a:xfrm>
+                    <a:prstGeom prst="rect">
+                      <a:avLst/>
+                    </a:prstGeom>
+                  </pic:spPr>
+                </pic:pic>
+              </a:graphicData>
+            </a:graphic>
+          </wp:inline>
+        </w:drawing>
+      </w:r>
+    </w:p>
+    <w:p>
+      <w:pPr>
+        <w:rPr>
+          <w:rFonts w:ascii="Times New Roman" w:hAnsi="Times New Roman" w:cs="Times New Roman"/>
+          <w:sz w:val="26"/>
+          <w:szCs w:val="26"/>
+        </w:rPr>
+      </w:pPr>
+      <w:r>
+        <w:rPr>
+          <w:rFonts w:ascii="Times New Roman" w:hAnsi="Times New Roman" w:cs="Times New Roman"/>
+          <w:sz w:val="26"/>
+          <w:szCs w:val="26"/>
+        </w:rPr>
+        <w:lastRenderedPageBreak/>
+        <w:t>4</w:t>
+      </w:r>
+      <w:r>
+        <w:rPr>
+          <w:rFonts w:ascii="Times New Roman" w:hAnsi="Times New Roman" w:cs="Times New Roman"/>
+          <w:sz w:val="26"/>
+          <w:szCs w:val="26"/>
+        </w:rPr>
+        <w:t xml:space="preserve">. </w:t>
+      </w:r>
+      <w:r>
+        <w:rPr>
+          <w:rFonts w:ascii="Times New Roman" w:hAnsi="Times New Roman" w:cs="Times New Roman"/>
+          <w:sz w:val="26"/>
+          <w:szCs w:val="26"/>
+        </w:rPr>
+        <w:t>Bài 4: Tạo Dockerfile chạy một trang web tĩnh bằng Nginx</w:t>
+      </w:r>
+    </w:p>
+    <w:p>
+      <w:pPr>
+        <w:rPr>
+          <w:rFonts w:ascii="Times New Roman" w:hAnsi="Times New Roman" w:cs="Times New Roman"/>
+          <w:sz w:val="26"/>
+          <w:szCs w:val="26"/>
+        </w:rPr>
+      </w:pPr>
+      <w:r>
+        <w:rPr>
+          <w:rFonts w:ascii="Times New Roman" w:hAnsi="Times New Roman" w:cs="Times New Roman"/>
+          <w:sz w:val="26"/>
+          <w:szCs w:val="26"/>
+        </w:rPr>
+        <w:drawing>
+          <wp:inline distT="0" distB="0" distL="0" distR="0" wp14:anchorId="3AE05734" wp14:editId="1D0018B5">
+            <wp:extent cx="5943600" cy="1795780"/>
+            <wp:effectExtent l="0" t="0" r="0" b="0"/>
+            <wp:docPr id="42" name="Picture 42"/>
+            <wp:cNvGraphicFramePr>
+              <a:graphicFrameLocks xmlns:a="http://schemas.openxmlformats.org/drawingml/2006/main" noChangeAspect="1"/>
+            </wp:cNvGraphicFramePr>
+            <a:graphic xmlns:a="http://schemas.openxmlformats.org/drawingml/2006/main">
+              <a:graphicData uri="http://schemas.openxmlformats.org/drawingml/2006/picture">
+                <pic:pic xmlns:pic="http://schemas.openxmlformats.org/drawingml/2006/picture">
+                  <pic:nvPicPr>
+                    <pic:cNvPr id="1" name=""/>
+                    <pic:cNvPicPr/>
+                  </pic:nvPicPr>
+                  <pic:blipFill>
+                    <a:blip r:embed="rId43"/>
+                    <a:stretch>
+                      <a:fillRect/>
+                    </a:stretch>
+                  </pic:blipFill>
+                  <pic:spPr>
+                    <a:xfrm>
+                      <a:off x="0" y="0"/>
+                      <a:ext cx="5943600" cy="1795780"/>
+                    </a:xfrm>
+                    <a:prstGeom prst="rect">
+                      <a:avLst/>
+                    </a:prstGeom>
+                  </pic:spPr>
+                </pic:pic>
+              </a:graphicData>
+            </a:graphic>
+          </wp:inline>
+        </w:drawing>
+      </w:r>
+      <w:r>
+        <w:rPr>
+          <w:rFonts w:ascii="Times New Roman" w:hAnsi="Times New Roman" w:cs="Times New Roman"/>
+          <w:sz w:val="26"/>
+          <w:szCs w:val="26"/>
+        </w:rPr>
+        <w:drawing>
+          <wp:inline distT="0" distB="0" distL="0" distR="0" wp14:anchorId="3E29D0FA" wp14:editId="14C36ADD">
+            <wp:extent cx="5943600" cy="1534795"/>
+            <wp:effectExtent l="0" t="0" r="0" b="8255"/>
+            <wp:docPr id="43" name="Picture 43"/>
+            <wp:cNvGraphicFramePr>
+              <a:graphicFrameLocks xmlns:a="http://schemas.openxmlformats.org/drawingml/2006/main" noChangeAspect="1"/>
+            </wp:cNvGraphicFramePr>
+            <a:graphic xmlns:a="http://schemas.openxmlformats.org/drawingml/2006/main">
+              <a:graphicData uri="http://schemas.openxmlformats.org/drawingml/2006/picture">
+                <pic:pic xmlns:pic="http://schemas.openxmlformats.org/drawingml/2006/picture">
+                  <pic:nvPicPr>
+                    <pic:cNvPr id="1" name=""/>
+                    <pic:cNvPicPr/>
+                  </pic:nvPicPr>
+                  <pic:blipFill>
+                    <a:blip r:embed="rId44"/>
+                    <a:stretch>
+                      <a:fillRect/>
+                    </a:stretch>
+                  </pic:blipFill>
+                  <pic:spPr>
+                    <a:xfrm>
+                      <a:off x="0" y="0"/>
+                      <a:ext cx="5943600" cy="1534795"/>
+                    </a:xfrm>
+                    <a:prstGeom prst="rect">
+                      <a:avLst/>
+                    </a:prstGeom>
+                  </pic:spPr>
+                </pic:pic>
+              </a:graphicData>
+            </a:graphic>
+          </wp:inline>
+        </w:drawing>
+      </w:r>
+    </w:p>
+    <w:p>
+      <w:pPr>
+        <w:rPr>
+          <w:rFonts w:ascii="Times New Roman" w:hAnsi="Times New Roman" w:cs="Times New Roman"/>
+          <w:sz w:val="26"/>
+          <w:szCs w:val="26"/>
+        </w:rPr>
+      </w:pPr>
+      <w:r>
+        <w:rPr>
+          <w:rFonts w:ascii="Times New Roman" w:hAnsi="Times New Roman" w:cs="Times New Roman"/>
+          <w:sz w:val="26"/>
+          <w:szCs w:val="26"/>
+        </w:rPr>
+        <w:drawing>
+          <wp:inline distT="0" distB="0" distL="0" distR="0" wp14:anchorId="457BD199" wp14:editId="25258E35">
+            <wp:extent cx="5943600" cy="4015105"/>
+            <wp:effectExtent l="0" t="0" r="0" b="4445"/>
+            <wp:docPr id="44" name="Picture 44"/>
+            <wp:cNvGraphicFramePr>
+              <a:graphicFrameLocks xmlns:a="http://schemas.openxmlformats.org/drawingml/2006/main" noChangeAspect="1"/>
+            </wp:cNvGraphicFramePr>
+            <a:graphic xmlns:a="http://schemas.openxmlformats.org/drawingml/2006/main">
+              <a:graphicData uri="http://schemas.openxmlformats.org/drawingml/2006/picture">
+                <pic:pic xmlns:pic="http://schemas.openxmlformats.org/drawingml/2006/picture">
+                  <pic:nvPicPr>
+                    <pic:cNvPr id="1" name=""/>
+                    <pic:cNvPicPr/>
+                  </pic:nvPicPr>
+                  <pic:blipFill>
+                    <a:blip r:embed="rId45"/>
+                    <a:stretch>
+                      <a:fillRect/>
+                    </a:stretch>
+                  </pic:blipFill>
+                  <pic:spPr>
+                    <a:xfrm>
+                      <a:off x="0" y="0"/>
+                      <a:ext cx="5943600" cy="4015105"/>
+                    </a:xfrm>
+                    <a:prstGeom prst="rect">
+                      <a:avLst/>
+                    </a:prstGeom>
+                  </pic:spPr>
+                </pic:pic>
+              </a:graphicData>
+            </a:graphic>
+          </wp:inline>
+        </w:drawing>
+      </w:r>
+    </w:p>
+    <w:p>
+      <w:pPr>
+        <w:rPr>
+          <w:rFonts w:ascii="Times New Roman" w:hAnsi="Times New Roman" w:cs="Times New Roman"/>
+          <w:sz w:val="26"/>
+          <w:szCs w:val="26"/>
+        </w:rPr>
+      </w:pPr>
+      <w:r>
+        <w:rPr>
+          <w:rFonts w:ascii="Times New Roman" w:hAnsi="Times New Roman" w:cs="Times New Roman"/>
+          <w:sz w:val="26"/>
+          <w:szCs w:val="26"/>
+        </w:rPr>
+        <w:t>5</w:t>
+      </w:r>
+      <w:r>
+        <w:rPr>
+          <w:rFonts w:ascii="Times New Roman" w:hAnsi="Times New Roman" w:cs="Times New Roman"/>
+          <w:sz w:val="26"/>
+          <w:szCs w:val="26"/>
+        </w:rPr>
+        <w:t xml:space="preserve">. </w:t>
+      </w:r>
+      <w:r>
+        <w:rPr>
+          <w:rFonts w:ascii="Times New Roman" w:hAnsi="Times New Roman" w:cs="Times New Roman"/>
+          <w:sz w:val="26"/>
+          <w:szCs w:val="26"/>
+        </w:rPr>
+        <w:t>Bài 5: Tạo Dockerfile cho ứng dụng Go</w:t>
+      </w:r>
+    </w:p>
+    <w:p>
+      <w:pPr>
+        <w:rPr>
+          <w:rFonts w:ascii="Times New Roman" w:hAnsi="Times New Roman" w:cs="Times New Roman"/>
+          <w:sz w:val="26"/>
+          <w:szCs w:val="26"/>
+        </w:rPr>
+      </w:pPr>
+      <w:r>
+        <w:rPr>
+          <w:rFonts w:ascii="Times New Roman" w:hAnsi="Times New Roman" w:cs="Times New Roman"/>
+          <w:sz w:val="26"/>
+          <w:szCs w:val="26"/>
+        </w:rPr>
+        <w:lastRenderedPageBreak/>
+        <w:drawing>
+          <wp:inline distT="0" distB="0" distL="0" distR="0" wp14:anchorId="7A3FB26D" wp14:editId="0F8D9F95">
+            <wp:extent cx="5943600" cy="2534920"/>
+            <wp:effectExtent l="0" t="0" r="0" b="0"/>
+            <wp:docPr id="46" name="Picture 46"/>
+            <wp:cNvGraphicFramePr>
+              <a:graphicFrameLocks xmlns:a="http://schemas.openxmlformats.org/drawingml/2006/main" noChangeAspect="1"/>
+            </wp:cNvGraphicFramePr>
+            <a:graphic xmlns:a="http://schemas.openxmlformats.org/drawingml/2006/main">
+              <a:graphicData uri="http://schemas.openxmlformats.org/drawingml/2006/picture">
+                <pic:pic xmlns:pic="http://schemas.openxmlformats.org/drawingml/2006/picture">
+                  <pic:nvPicPr>
+                    <pic:cNvPr id="1" name=""/>
+                    <pic:cNvPicPr/>
+                  </pic:nvPicPr>
+                  <pic:blipFill>
+                    <a:blip r:embed="rId46"/>
+                    <a:stretch>
+                      <a:fillRect/>
+                    </a:stretch>
+                  </pic:blipFill>
+                  <pic:spPr>
+                    <a:xfrm>
+                      <a:off x="0" y="0"/>
+                      <a:ext cx="5943600" cy="2534920"/>
+                    </a:xfrm>
+                    <a:prstGeom prst="rect">
+                      <a:avLst/>
+                    </a:prstGeom>
+                  </pic:spPr>
+                </pic:pic>
+              </a:graphicData>
+            </a:graphic>
+          </wp:inline>
+        </w:drawing>
+      </w:r>
+    </w:p>
+    <w:p>
+      <w:pPr>
+        <w:rPr>
+          <w:rFonts w:ascii="Times New Roman" w:hAnsi="Times New Roman" w:cs="Times New Roman"/>
+          <w:sz w:val="26"/>
+          <w:szCs w:val="26"/>
+        </w:rPr>
+      </w:pPr>
+    </w:p>
+    <w:p>
+      <w:pPr>
+        <w:rPr>
+          <w:rFonts w:ascii="Times New Roman" w:hAnsi="Times New Roman" w:cs="Times New Roman"/>
+          <w:sz w:val="26"/>
+          <w:szCs w:val="26"/>
+        </w:rPr>
+      </w:pPr>
+      <w:r>
+        <w:rPr>
+          <w:rFonts w:ascii="Times New Roman" w:hAnsi="Times New Roman" w:cs="Times New Roman"/>
+          <w:sz w:val="26"/>
+          <w:szCs w:val="26"/>
+        </w:rPr>
+        <w:drawing>
+          <wp:inline distT="0" distB="0" distL="0" distR="0" wp14:anchorId="39BF8852" wp14:editId="350A4832">
+            <wp:extent cx="5943600" cy="1720850"/>
+            <wp:effectExtent l="0" t="0" r="0" b="0"/>
+            <wp:docPr id="45" name="Picture 45"/>
+            <wp:cNvGraphicFramePr>
+              <a:graphicFrameLocks xmlns:a="http://schemas.openxmlformats.org/drawingml/2006/main" noChangeAspect="1"/>
+            </wp:cNvGraphicFramePr>
+            <a:graphic xmlns:a="http://schemas.openxmlformats.org/drawingml/2006/main">
+              <a:graphicData uri="http://schemas.openxmlformats.org/drawingml/2006/picture">
+                <pic:pic xmlns:pic="http://schemas.openxmlformats.org/drawingml/2006/picture">
+                  <pic:nvPicPr>
+                    <pic:cNvPr id="1" name=""/>
+                    <pic:cNvPicPr/>
+                  </pic:nvPicPr>
+                  <pic:blipFill>
+                    <a:blip r:embed="rId47"/>
+                    <a:stretch>
+                      <a:fillRect/>
+                    </a:stretch>
+                  </pic:blipFill>
+                  <pic:spPr>
+                    <a:xfrm>
+                      <a:off x="0" y="0"/>
+                      <a:ext cx="5943600" cy="1720850"/>
+                    </a:xfrm>
+                    <a:prstGeom prst="rect">
+                      <a:avLst/>
+                    </a:prstGeom>
+                  </pic:spPr>
+                </pic:pic>
+              </a:graphicData>
+            </a:graphic>
+          </wp:inline>
+        </w:drawing>
+      </w:r>
+    </w:p>
+    <w:p>
+      <w:pPr>
+        <w:rPr>
+          <w:rFonts w:ascii="Times New Roman" w:hAnsi="Times New Roman" w:cs="Times New Roman"/>
+          <w:sz w:val="26"/>
+          <w:szCs w:val="26"/>
+        </w:rPr>
+      </w:pPr>
+      <w:r>
+        <w:rPr>
+          <w:rFonts w:ascii="Times New Roman" w:hAnsi="Times New Roman" w:cs="Times New Roman"/>
+          <w:sz w:val="26"/>
+          <w:szCs w:val="26"/>
+        </w:rPr>
+        <w:drawing>
+          <wp:inline distT="0" distB="0" distL="0" distR="0" wp14:anchorId="1818C6D1" wp14:editId="098FF581">
+            <wp:extent cx="4963218" cy="2143424"/>
+            <wp:effectExtent l="0" t="0" r="8890" b="9525"/>
+            <wp:docPr id="48" name="Picture 48"/>
+            <wp:cNvGraphicFramePr>
+              <a:graphicFrameLocks xmlns:a="http://schemas.openxmlformats.org/drawingml/2006/main" noChangeAspect="1"/>
+            </wp:cNvGraphicFramePr>
+            <a:graphic xmlns:a="http://schemas.openxmlformats.org/drawingml/2006/main">
+              <a:graphicData uri="http://schemas.openxmlformats.org/drawingml/2006/picture">
+                <pic:pic xmlns:pic="http://schemas.openxmlformats.org/drawingml/2006/picture">
+                  <pic:nvPicPr>
+                    <pic:cNvPr id="1" name=""/>
+                    <pic:cNvPicPr/>
+                  </pic:nvPicPr>
+                  <pic:blipFill>
+                    <a:blip r:embed="rId48"/>
+                    <a:stretch>
+                      <a:fillRect/>
+                    </a:stretch>
+                  </pic:blipFill>
+                  <pic:spPr>
+                    <a:xfrm>
+                      <a:off x="0" y="0"/>
+                      <a:ext cx="4963218" cy="2143424"/>
+                    </a:xfrm>
+                    <a:prstGeom prst="rect">
+                      <a:avLst/>
+                    </a:prstGeom>
+                  </pic:spPr>
+                </pic:pic>
+              </a:graphicData>
+            </a:graphic>
+          </wp:inline>
+        </w:drawing>
+      </w:r>
+    </w:p>
+    <w:p>
+      <w:pPr>
+        <w:rPr>
+          <w:rFonts w:ascii="Times New Roman" w:hAnsi="Times New Roman" w:cs="Times New Roman"/>
+          <w:sz w:val="26"/>
+          <w:szCs w:val="26"/>
+        </w:rPr>
+      </w:pPr>
+      <w:r>
+        <w:rPr>
+          <w:rFonts w:ascii="Times New Roman" w:hAnsi="Times New Roman" w:cs="Times New Roman"/>
+          <w:sz w:val="26"/>
+          <w:szCs w:val="26"/>
+        </w:rPr>
+        <w:t>6</w:t>
+      </w:r>
+      <w:r>
+        <w:rPr>
+          <w:rFonts w:ascii="Times New Roman" w:hAnsi="Times New Roman" w:cs="Times New Roman"/>
+          <w:sz w:val="26"/>
+          <w:szCs w:val="26"/>
+        </w:rPr>
+        <w:t xml:space="preserve">. </w:t>
+      </w:r>
+      <w:r>
+        <w:rPr>
+          <w:rFonts w:ascii="Times New Roman" w:hAnsi="Times New Roman" w:cs="Times New Roman"/>
+          <w:sz w:val="26"/>
+          <w:szCs w:val="26"/>
+        </w:rPr>
+        <w:t>Bài 6: Sử dụng Multi-stage Build trong Dockerfile</w:t>
+      </w:r>
+    </w:p>
+    <w:p>
+      <w:pPr>
+        <w:rPr>
+          <w:rFonts w:ascii="Times New Roman" w:hAnsi="Times New Roman" w:cs="Times New Roman"/>
+          <w:sz w:val="26"/>
+          <w:szCs w:val="26"/>
+        </w:rPr>
+      </w:pPr>
     </w:p>
     <w:p>
       <w:pPr>

</xml_diff>